<commit_message>
feat: adición de links de archivos de google sheet e informe
</commit_message>
<xml_diff>
--- a/documentacion-tecnica.docx
+++ b/documentacion-tecnica.docx
@@ -11,32 +11,14 @@
           <w:lang w:val="es-CO"/>
         </w:rPr>
       </w:pPr>
-      <w:bookmarkStart w:id="0" w:name="_GoBack"/>
       <w:r>
         <w:rPr>
           <w:sz w:val="44"/>
           <w:lang w:val="es-CO"/>
         </w:rPr>
-        <w:t xml:space="preserve">Plataforma de </w:t>
-      </w:r>
-      <w:proofErr w:type="spellStart"/>
-      <w:r>
-        <w:rPr>
-          <w:sz w:val="44"/>
-          <w:lang w:val="es-CO"/>
-        </w:rPr>
-        <w:t>Feedback</w:t>
-      </w:r>
-      <w:proofErr w:type="spellEnd"/>
-      <w:r>
-        <w:rPr>
-          <w:sz w:val="44"/>
-          <w:lang w:val="es-CO"/>
-        </w:rPr>
-        <w:t xml:space="preserve"> – Alegra</w:t>
-      </w:r>
-    </w:p>
-    <w:bookmarkEnd w:id="0"/>
+        <w:t>Plataforma de Feedback – Alegra</w:t>
+      </w:r>
+    </w:p>
     <w:p>
       <w:pPr>
         <w:pStyle w:val="Ttulo1"/>
@@ -63,62 +45,7 @@
           <w:color w:val="444444"/>
           <w:lang w:val="es-CO"/>
         </w:rPr>
-        <w:t xml:space="preserve">Este sistema permite recolectar, almacenar y analizar el </w:t>
-      </w:r>
-      <w:proofErr w:type="spellStart"/>
-      <w:r>
-        <w:rPr>
-          <w:color w:val="444444"/>
-          <w:lang w:val="es-CO"/>
-        </w:rPr>
-        <w:t>feedback</w:t>
-      </w:r>
-      <w:proofErr w:type="spellEnd"/>
-      <w:r>
-        <w:rPr>
-          <w:color w:val="444444"/>
-          <w:lang w:val="es-CO"/>
-        </w:rPr>
-        <w:t xml:space="preserve"> de los clientes de Alegra. Cuando un usuario envía un comentario desde el formulario web, el sistema lo guarda en Google </w:t>
-      </w:r>
-      <w:proofErr w:type="spellStart"/>
-      <w:r>
-        <w:rPr>
-          <w:color w:val="444444"/>
-          <w:lang w:val="es-CO"/>
-        </w:rPr>
-        <w:t>Sheets</w:t>
-      </w:r>
-      <w:proofErr w:type="spellEnd"/>
-      <w:r>
-        <w:rPr>
-          <w:color w:val="444444"/>
-          <w:lang w:val="es-CO"/>
-        </w:rPr>
-        <w:t xml:space="preserve"> y usa la API de </w:t>
-      </w:r>
-      <w:proofErr w:type="spellStart"/>
-      <w:r>
-        <w:rPr>
-          <w:color w:val="444444"/>
-          <w:lang w:val="es-CO"/>
-        </w:rPr>
-        <w:t>Gemini</w:t>
-      </w:r>
-      <w:proofErr w:type="spellEnd"/>
-      <w:r>
-        <w:rPr>
-          <w:color w:val="444444"/>
-          <w:lang w:val="es-CO"/>
-        </w:rPr>
-        <w:t xml:space="preserve"> para clasificar el sentimiento (Positiv</w:t>
-      </w:r>
-      <w:r>
-        <w:rPr>
-          <w:color w:val="444444"/>
-          <w:lang w:val="es-CO"/>
-        </w:rPr>
-        <w:t>o, Neutro o Negativo) y generar un resumen automático.</w:t>
+        <w:t>Este sistema permite recolectar, almacenar y analizar el feedback de los clientes de Alegra. Cuando un usuario envía un comentario desde el formulario web, el sistema lo guarda en Google Sheets y usa la API de Gemini para clasificar el sentimiento (Positivo, Neutro o Negativo) y generar un resumen automático.</w:t>
       </w:r>
     </w:p>
     <w:p>
@@ -147,23 +74,16 @@
     <w:p>
       <w:pPr>
         <w:pStyle w:val="Ttulo1"/>
-      </w:pPr>
-      <w:r>
-        <w:t xml:space="preserve">2. </w:t>
-      </w:r>
-      <w:proofErr w:type="spellStart"/>
-      <w:r>
-        <w:t>Archivos</w:t>
-      </w:r>
-      <w:proofErr w:type="spellEnd"/>
-      <w:r>
-        <w:t xml:space="preserve"> del </w:t>
-      </w:r>
-      <w:proofErr w:type="spellStart"/>
-      <w:r>
-        <w:t>repositorio</w:t>
-      </w:r>
-      <w:proofErr w:type="spellEnd"/>
+        <w:rPr>
+          <w:lang w:val="es-CO"/>
+        </w:rPr>
+      </w:pPr>
+      <w:r>
+        <w:rPr>
+          <w:lang w:val="es-CO"/>
+        </w:rPr>
+        <w:t>2. Archivos del repositorio</w:t>
+      </w:r>
     </w:p>
     <w:p>
       <w:pPr>
@@ -177,14 +97,7 @@
           <w:color w:val="444444"/>
           <w:lang w:val="es-CO"/>
         </w:rPr>
-        <w:t>El repositorio contiene los s</w:t>
-      </w:r>
-      <w:r>
-        <w:rPr>
-          <w:color w:val="444444"/>
-          <w:lang w:val="es-CO"/>
-        </w:rPr>
-        <w:t>iguientes archivos:</w:t>
+        <w:t>El repositorio contiene los siguientes archivos:</w:t>
       </w:r>
     </w:p>
     <w:p>
@@ -217,12 +130,6 @@
         <w:gridCol w:w="6560"/>
       </w:tblGrid>
       <w:tr>
-        <w:tblPrEx>
-          <w:tblCellMar>
-            <w:top w:w="0" w:type="dxa"/>
-            <w:bottom w:w="0" w:type="dxa"/>
-          </w:tblCellMar>
-        </w:tblPrEx>
         <w:tc>
           <w:tcPr>
             <w:tcW w:w="2800" w:type="dxa"/>
@@ -241,7 +148,6 @@
             </w:tcMar>
           </w:tcPr>
           <w:p>
-            <w:proofErr w:type="spellStart"/>
             <w:r>
               <w:rPr>
                 <w:b/>
@@ -252,7 +158,6 @@
               </w:rPr>
               <w:t>Archivo</w:t>
             </w:r>
-            <w:proofErr w:type="spellEnd"/>
           </w:p>
         </w:tc>
         <w:tc>
@@ -273,7 +178,6 @@
             </w:tcMar>
           </w:tcPr>
           <w:p>
-            <w:proofErr w:type="spellStart"/>
             <w:r>
               <w:rPr>
                 <w:b/>
@@ -284,17 +188,10 @@
               </w:rPr>
               <w:t>Descripción</w:t>
             </w:r>
-            <w:proofErr w:type="spellEnd"/>
           </w:p>
         </w:tc>
       </w:tr>
       <w:tr>
-        <w:tblPrEx>
-          <w:tblCellMar>
-            <w:top w:w="0" w:type="dxa"/>
-            <w:bottom w:w="0" w:type="dxa"/>
-          </w:tblCellMar>
-        </w:tblPrEx>
         <w:tc>
           <w:tcPr>
             <w:tcW w:w="2800" w:type="dxa"/>
@@ -359,12 +256,6 @@
         </w:tc>
       </w:tr>
       <w:tr>
-        <w:tblPrEx>
-          <w:tblCellMar>
-            <w:top w:w="0" w:type="dxa"/>
-            <w:bottom w:w="0" w:type="dxa"/>
-          </w:tblCellMar>
-        </w:tblPrEx>
         <w:tc>
           <w:tcPr>
             <w:tcW w:w="2800" w:type="dxa"/>
@@ -437,12 +328,6 @@
         </w:tc>
       </w:tr>
       <w:tr>
-        <w:tblPrEx>
-          <w:tblCellMar>
-            <w:top w:w="0" w:type="dxa"/>
-            <w:bottom w:w="0" w:type="dxa"/>
-          </w:tblCellMar>
-        </w:tblPrEx>
         <w:tc>
           <w:tcPr>
             <w:tcW w:w="2800" w:type="dxa"/>
@@ -520,13 +405,8 @@
         <w:pStyle w:val="Ttulo1"/>
       </w:pPr>
       <w:r>
-        <w:t xml:space="preserve">3. Requisitos </w:t>
-      </w:r>
-      <w:proofErr w:type="spellStart"/>
-      <w:r>
-        <w:t>previos</w:t>
-      </w:r>
-      <w:proofErr w:type="spellEnd"/>
+        <w:t>3. Requisitos previos</w:t>
+      </w:r>
     </w:p>
     <w:p>
       <w:pPr>
@@ -537,33 +417,11 @@
         </w:numPr>
         <w:spacing w:after="80"/>
       </w:pPr>
-      <w:proofErr w:type="spellStart"/>
-      <w:r>
-        <w:rPr>
-          <w:color w:val="444444"/>
-        </w:rPr>
-        <w:t>Cuenta</w:t>
-      </w:r>
-      <w:proofErr w:type="spellEnd"/>
-      <w:r>
-        <w:rPr>
-          <w:color w:val="444444"/>
-        </w:rPr>
-        <w:t xml:space="preserve"> de Google (Gmail) para </w:t>
-      </w:r>
-      <w:proofErr w:type="spellStart"/>
-      <w:r>
-        <w:rPr>
-          <w:color w:val="444444"/>
-        </w:rPr>
-        <w:t>usar</w:t>
-      </w:r>
-      <w:proofErr w:type="spellEnd"/>
-      <w:r>
-        <w:rPr>
-          <w:color w:val="444444"/>
-        </w:rPr>
-        <w:t xml:space="preserve"> Sheets, Apps Script y Looker Studio</w:t>
+      <w:r>
+        <w:rPr>
+          <w:color w:val="444444"/>
+        </w:rPr>
+        <w:t>Cuenta de Google (Gmail) para usar Sheets, Apps Script y Looker Studio</w:t>
       </w:r>
     </w:p>
     <w:p>
@@ -583,33 +441,8 @@
           <w:color w:val="444444"/>
           <w:lang w:val="es-CO"/>
         </w:rPr>
-        <w:t xml:space="preserve">API Key de </w:t>
-      </w:r>
-      <w:proofErr w:type="spellStart"/>
-      <w:r>
-        <w:rPr>
-          <w:color w:val="444444"/>
-          <w:lang w:val="es-CO"/>
-        </w:rPr>
-        <w:t>Gemini</w:t>
-      </w:r>
-      <w:proofErr w:type="spellEnd"/>
-      <w:r>
-        <w:rPr>
-          <w:color w:val="444444"/>
-          <w:lang w:val="es-CO"/>
-        </w:rPr>
-        <w:t xml:space="preserve"> gratuita — disponible en aistudio.google.com/app/</w:t>
-      </w:r>
-      <w:proofErr w:type="spellStart"/>
-      <w:r>
-        <w:rPr>
-          <w:color w:val="444444"/>
-          <w:lang w:val="es-CO"/>
-        </w:rPr>
-        <w:t>apikey</w:t>
-      </w:r>
-      <w:proofErr w:type="spellEnd"/>
+        <w:t>API Key de Gemini gratuita — disponible en aistudio.google.com/app/apikey</w:t>
+      </w:r>
     </w:p>
     <w:p>
       <w:pPr>
@@ -620,33 +453,11 @@
         </w:numPr>
         <w:spacing w:after="80"/>
       </w:pPr>
-      <w:proofErr w:type="spellStart"/>
-      <w:r>
-        <w:rPr>
-          <w:color w:val="444444"/>
-        </w:rPr>
-        <w:t>Navegador</w:t>
-      </w:r>
-      <w:proofErr w:type="spellEnd"/>
-      <w:r>
-        <w:rPr>
-          <w:color w:val="444444"/>
-        </w:rPr>
-        <w:t xml:space="preserve"> web (Chrome </w:t>
-      </w:r>
-      <w:proofErr w:type="spellStart"/>
-      <w:r>
-        <w:rPr>
-          <w:color w:val="444444"/>
-        </w:rPr>
-        <w:t>recomendado</w:t>
-      </w:r>
-      <w:proofErr w:type="spellEnd"/>
-      <w:r>
-        <w:rPr>
-          <w:color w:val="444444"/>
-        </w:rPr>
-        <w:t>)</w:t>
+      <w:r>
+        <w:rPr>
+          <w:color w:val="444444"/>
+        </w:rPr>
+        <w:t>Navegador web (Chrome recomendado)</w:t>
       </w:r>
     </w:p>
     <w:p>
@@ -680,23 +491,16 @@
     <w:p>
       <w:pPr>
         <w:pStyle w:val="Ttulo1"/>
-      </w:pPr>
-      <w:r>
-        <w:t xml:space="preserve">4. Cómo </w:t>
-      </w:r>
-      <w:proofErr w:type="spellStart"/>
-      <w:r>
-        <w:t>descargar</w:t>
-      </w:r>
-      <w:proofErr w:type="spellEnd"/>
-      <w:r>
-        <w:t xml:space="preserve"> el </w:t>
-      </w:r>
-      <w:proofErr w:type="spellStart"/>
-      <w:r>
-        <w:t>proyecto</w:t>
-      </w:r>
-      <w:proofErr w:type="spellEnd"/>
+        <w:rPr>
+          <w:lang w:val="es-CO"/>
+        </w:rPr>
+      </w:pPr>
+      <w:r>
+        <w:rPr>
+          <w:lang w:val="es-CO"/>
+        </w:rPr>
+        <w:t>4. Cómo descargar el proyecto</w:t>
+      </w:r>
     </w:p>
     <w:p>
       <w:pPr>
@@ -713,21 +517,7 @@
         <w:rPr>
           <w:color w:val="444444"/>
         </w:rPr>
-        <w:t xml:space="preserve">Para </w:t>
-      </w:r>
-      <w:proofErr w:type="spellStart"/>
-      <w:r>
-        <w:rPr>
-          <w:color w:val="444444"/>
-        </w:rPr>
-        <w:t>descargarlo</w:t>
-      </w:r>
-      <w:proofErr w:type="spellEnd"/>
-      <w:r>
-        <w:rPr>
-          <w:color w:val="444444"/>
-        </w:rPr>
-        <w:t>:</w:t>
+        <w:t>Para descargarlo:</w:t>
       </w:r>
     </w:p>
     <w:p>
@@ -744,33 +534,11 @@
         </w:numPr>
         <w:spacing w:after="80"/>
       </w:pPr>
-      <w:proofErr w:type="spellStart"/>
-      <w:r>
-        <w:rPr>
-          <w:color w:val="444444"/>
-        </w:rPr>
-        <w:t>Ir</w:t>
-      </w:r>
-      <w:proofErr w:type="spellEnd"/>
-      <w:r>
-        <w:rPr>
-          <w:color w:val="444444"/>
-        </w:rPr>
-        <w:t xml:space="preserve"> al </w:t>
-      </w:r>
-      <w:proofErr w:type="spellStart"/>
-      <w:r>
-        <w:rPr>
-          <w:color w:val="444444"/>
-        </w:rPr>
-        <w:t>repositorio</w:t>
-      </w:r>
-      <w:proofErr w:type="spellEnd"/>
-      <w:r>
-        <w:rPr>
-          <w:color w:val="444444"/>
-        </w:rPr>
-        <w:t xml:space="preserve"> en GitHub</w:t>
+      <w:r>
+        <w:rPr>
+          <w:color w:val="444444"/>
+        </w:rPr>
+        <w:t>Ir al repositorio en GitHub</w:t>
       </w:r>
     </w:p>
     <w:p>
@@ -790,17 +558,8 @@
           <w:color w:val="444444"/>
           <w:lang w:val="es-CO"/>
         </w:rPr>
-        <w:t xml:space="preserve">Hacer clic en el botón verde </w:t>
-      </w:r>
-      <w:proofErr w:type="spellStart"/>
-      <w:r>
-        <w:rPr>
-          <w:color w:val="444444"/>
-          <w:lang w:val="es-CO"/>
-        </w:rPr>
-        <w:t>Code</w:t>
-      </w:r>
-      <w:proofErr w:type="spellEnd"/>
+        <w:t>Hacer clic en el botón verde Code</w:t>
+      </w:r>
     </w:p>
     <w:p>
       <w:pPr>
@@ -811,19 +570,11 @@
         </w:numPr>
         <w:spacing w:after="80"/>
       </w:pPr>
-      <w:proofErr w:type="spellStart"/>
-      <w:r>
-        <w:rPr>
-          <w:color w:val="444444"/>
-        </w:rPr>
-        <w:t>Seleccionar</w:t>
-      </w:r>
-      <w:proofErr w:type="spellEnd"/>
-      <w:r>
-        <w:rPr>
-          <w:color w:val="444444"/>
-        </w:rPr>
-        <w:t xml:space="preserve"> Download ZIP</w:t>
+      <w:r>
+        <w:rPr>
+          <w:color w:val="444444"/>
+        </w:rPr>
+        <w:t>Seleccionar Download ZIP</w:t>
       </w:r>
     </w:p>
     <w:p>
@@ -908,31 +659,16 @@
     <w:p>
       <w:pPr>
         <w:pStyle w:val="Ttulo1"/>
-      </w:pPr>
-      <w:r>
-        <w:t xml:space="preserve">5. </w:t>
-      </w:r>
-      <w:proofErr w:type="spellStart"/>
-      <w:r>
-        <w:t>Configuración</w:t>
-      </w:r>
-      <w:proofErr w:type="spellEnd"/>
-      <w:r>
-        <w:t xml:space="preserve"> </w:t>
-      </w:r>
-      <w:proofErr w:type="spellStart"/>
-      <w:r>
-        <w:t>paso</w:t>
-      </w:r>
-      <w:proofErr w:type="spellEnd"/>
-      <w:r>
-        <w:t xml:space="preserve"> a </w:t>
-      </w:r>
-      <w:proofErr w:type="spellStart"/>
-      <w:r>
-        <w:t>paso</w:t>
-      </w:r>
-      <w:proofErr w:type="spellEnd"/>
+        <w:rPr>
+          <w:lang w:val="es-CO"/>
+        </w:rPr>
+      </w:pPr>
+      <w:r>
+        <w:rPr>
+          <w:lang w:val="es-CO"/>
+        </w:rPr>
+        <w:t>5. Configuración paso a paso</w:t>
+      </w:r>
     </w:p>
     <w:p>
       <w:pPr>
@@ -953,16 +689,8 @@
         <w:rPr>
           <w:lang w:val="es-CO"/>
         </w:rPr>
-        <w:t xml:space="preserve">Paso 1 – Crear el Google </w:t>
-      </w:r>
-      <w:proofErr w:type="spellStart"/>
-      <w:r>
-        <w:rPr>
-          <w:lang w:val="es-CO"/>
-        </w:rPr>
-        <w:t>Sheet</w:t>
-      </w:r>
-      <w:proofErr w:type="spellEnd"/>
+        <w:t>Paso 1 – Crear el Google Sheet</w:t>
+      </w:r>
     </w:p>
     <w:p>
       <w:pPr>
@@ -981,23 +709,7 @@
           <w:color w:val="444444"/>
           <w:lang w:val="es-CO"/>
         </w:rPr>
-        <w:t xml:space="preserve">Abrir </w:t>
-      </w:r>
-      <w:proofErr w:type="spellStart"/>
-      <w:r>
-        <w:rPr>
-          <w:color w:val="444444"/>
-          <w:lang w:val="es-CO"/>
-        </w:rPr>
-        <w:t>sheets.new</w:t>
-      </w:r>
-      <w:proofErr w:type="spellEnd"/>
-      <w:r>
-        <w:rPr>
-          <w:color w:val="444444"/>
-          <w:lang w:val="es-CO"/>
-        </w:rPr>
-        <w:t xml:space="preserve"> en el navegador</w:t>
+        <w:t>Abrir sheets.new en el navegador</w:t>
       </w:r>
     </w:p>
     <w:p>
@@ -1017,30 +729,7 @@
           <w:color w:val="444444"/>
           <w:lang w:val="es-CO"/>
         </w:rPr>
-        <w:t xml:space="preserve">Renombrar el archivo como: Alegra </w:t>
-      </w:r>
-      <w:proofErr w:type="spellStart"/>
-      <w:r>
-        <w:rPr>
-          <w:color w:val="444444"/>
-          <w:lang w:val="es-CO"/>
-        </w:rPr>
-        <w:t>Fe</w:t>
-      </w:r>
-      <w:r>
-        <w:rPr>
-          <w:color w:val="444444"/>
-          <w:lang w:val="es-CO"/>
-        </w:rPr>
-        <w:t>edback</w:t>
-      </w:r>
-      <w:proofErr w:type="spellEnd"/>
-      <w:r>
-        <w:rPr>
-          <w:color w:val="444444"/>
-          <w:lang w:val="es-CO"/>
-        </w:rPr>
-        <w:t xml:space="preserve"> System</w:t>
+        <w:t>Renombrar el archivo como: Alegra Feedback System</w:t>
       </w:r>
     </w:p>
     <w:p>
@@ -1060,17 +749,8 @@
           <w:color w:val="444444"/>
           <w:lang w:val="es-CO"/>
         </w:rPr>
-        <w:t xml:space="preserve">Renombrar la pestaña inferior como: </w:t>
-      </w:r>
-      <w:proofErr w:type="spellStart"/>
-      <w:r>
-        <w:rPr>
-          <w:color w:val="444444"/>
-          <w:lang w:val="es-CO"/>
-        </w:rPr>
-        <w:t>Feedback</w:t>
-      </w:r>
-      <w:proofErr w:type="spellEnd"/>
+        <w:t>Renombrar la pestaña inferior como: Feedback</w:t>
+      </w:r>
     </w:p>
     <w:p>
       <w:pPr>
@@ -1150,30 +830,7 @@
           <w:color w:val="444444"/>
           <w:lang w:val="es-CO"/>
         </w:rPr>
-        <w:t xml:space="preserve">En el Google </w:t>
-      </w:r>
-      <w:proofErr w:type="spellStart"/>
-      <w:r>
-        <w:rPr>
-          <w:color w:val="444444"/>
-          <w:lang w:val="es-CO"/>
-        </w:rPr>
-        <w:t>Sheet</w:t>
-      </w:r>
-      <w:proofErr w:type="spellEnd"/>
-      <w:r>
-        <w:rPr>
-          <w:color w:val="444444"/>
-          <w:lang w:val="es-CO"/>
-        </w:rPr>
-        <w:t xml:space="preserve"> i</w:t>
-      </w:r>
-      <w:r>
-        <w:rPr>
-          <w:color w:val="444444"/>
-          <w:lang w:val="es-CO"/>
-        </w:rPr>
-        <w:t>r a Extensiones &gt; Apps Script</w:t>
+        <w:t>En el Google Sheet ir a Extensiones &gt; Apps Script</w:t>
       </w:r>
     </w:p>
     <w:p>
@@ -1193,23 +850,7 @@
           <w:color w:val="444444"/>
           <w:lang w:val="es-CO"/>
         </w:rPr>
-        <w:t>Borrar todo el código que viene por defecto (</w:t>
-      </w:r>
-      <w:proofErr w:type="spellStart"/>
-      <w:r>
-        <w:rPr>
-          <w:color w:val="444444"/>
-          <w:lang w:val="es-CO"/>
-        </w:rPr>
-        <w:t>Ctrl+A</w:t>
-      </w:r>
-      <w:proofErr w:type="spellEnd"/>
-      <w:r>
-        <w:rPr>
-          <w:color w:val="444444"/>
-          <w:lang w:val="es-CO"/>
-        </w:rPr>
-        <w:t xml:space="preserve"> y borrar)</w:t>
+        <w:t>Borrar todo el código que viene por defecto (Ctrl+A y borrar)</w:t>
       </w:r>
     </w:p>
     <w:p>
@@ -1269,24 +910,8 @@
           <w:color w:val="444444"/>
           <w:lang w:val="es-CO"/>
         </w:rPr>
-        <w:t>En la línea 1 reemplazar TU_AP</w:t>
-      </w:r>
-      <w:r>
-        <w:rPr>
-          <w:color w:val="444444"/>
-          <w:lang w:val="es-CO"/>
-        </w:rPr>
-        <w:t xml:space="preserve">I_KEY_AQUI con la API Key de </w:t>
-      </w:r>
-      <w:proofErr w:type="spellStart"/>
-      <w:r>
-        <w:rPr>
-          <w:color w:val="444444"/>
-          <w:lang w:val="es-CO"/>
-        </w:rPr>
-        <w:t>Gemini</w:t>
-      </w:r>
-      <w:proofErr w:type="spellEnd"/>
+        <w:t>En la línea 1 reemplazar TU_API_KEY_AQUI con la API Key de Gemini</w:t>
+      </w:r>
     </w:p>
     <w:p>
       <w:pPr>
@@ -1300,28 +925,12 @@
           <w:lang w:val="es-CO"/>
         </w:rPr>
       </w:pPr>
-      <w:proofErr w:type="spellStart"/>
-      <w:r>
-        <w:rPr>
-          <w:color w:val="444444"/>
-        </w:rPr>
-        <w:t>Guardar</w:t>
-      </w:r>
-      <w:proofErr w:type="spellEnd"/>
-      <w:r>
-        <w:rPr>
-          <w:color w:val="444444"/>
-        </w:rPr>
-        <w:t xml:space="preserve"> con </w:t>
-      </w:r>
-      <w:proofErr w:type="spellStart"/>
-      <w:r>
-        <w:rPr>
-          <w:color w:val="444444"/>
-        </w:rPr>
-        <w:t>Ctrl+S</w:t>
-      </w:r>
-      <w:proofErr w:type="spellEnd"/>
+      <w:r>
+        <w:rPr>
+          <w:color w:val="444444"/>
+        </w:rPr>
+        <w:t>Guardar con Ctrl+S</w:t>
+      </w:r>
     </w:p>
     <w:p>
       <w:pPr>
@@ -1339,16 +948,8 @@
         <w:rPr>
           <w:lang w:val="es-CO"/>
         </w:rPr>
-        <w:t xml:space="preserve">Paso 3 – Obtener la API Key de </w:t>
-      </w:r>
-      <w:proofErr w:type="spellStart"/>
-      <w:r>
-        <w:rPr>
-          <w:lang w:val="es-CO"/>
-        </w:rPr>
-        <w:t>Gemini</w:t>
-      </w:r>
-      <w:proofErr w:type="spellEnd"/>
+        <w:t>Paso 3 – Obtener la API Key de Gemini</w:t>
+      </w:r>
     </w:p>
     <w:p>
       <w:pPr>
@@ -1367,23 +968,7 @@
           <w:color w:val="444444"/>
           <w:lang w:val="es-CO"/>
         </w:rPr>
-        <w:t>Ir a aistudio.google.com/app/</w:t>
-      </w:r>
-      <w:proofErr w:type="spellStart"/>
-      <w:r>
-        <w:rPr>
-          <w:color w:val="444444"/>
-          <w:lang w:val="es-CO"/>
-        </w:rPr>
-        <w:t>apikey</w:t>
-      </w:r>
-      <w:proofErr w:type="spellEnd"/>
-      <w:r>
-        <w:rPr>
-          <w:color w:val="444444"/>
-          <w:lang w:val="es-CO"/>
-        </w:rPr>
-        <w:t xml:space="preserve"> con una cuenta de Gmail personal</w:t>
+        <w:t>Ir a aistudio.google.com/app/apikey con una cuenta de Gmail personal</w:t>
       </w:r>
     </w:p>
     <w:p>
@@ -1395,33 +980,11 @@
         </w:numPr>
         <w:spacing w:after="80"/>
       </w:pPr>
-      <w:proofErr w:type="spellStart"/>
-      <w:r>
-        <w:rPr>
-          <w:color w:val="444444"/>
-        </w:rPr>
-        <w:t>Hacer</w:t>
-      </w:r>
-      <w:proofErr w:type="spellEnd"/>
-      <w:r>
-        <w:rPr>
-          <w:color w:val="444444"/>
-        </w:rPr>
-        <w:t xml:space="preserve"> </w:t>
-      </w:r>
-      <w:proofErr w:type="spellStart"/>
-      <w:r>
-        <w:rPr>
-          <w:color w:val="444444"/>
-        </w:rPr>
-        <w:t>clic</w:t>
-      </w:r>
-      <w:proofErr w:type="spellEnd"/>
-      <w:r>
-        <w:rPr>
-          <w:color w:val="444444"/>
-        </w:rPr>
-        <w:t xml:space="preserve"> en Create API Key &gt; Create API key in new project</w:t>
+      <w:r>
+        <w:rPr>
+          <w:color w:val="444444"/>
+        </w:rPr>
+        <w:t>Hacer clic en Create API Key &gt; Create API key in new project</w:t>
       </w:r>
     </w:p>
     <w:p>
@@ -1441,14 +1004,7 @@
           <w:color w:val="444444"/>
           <w:lang w:val="es-CO"/>
         </w:rPr>
-        <w:t>C</w:t>
-      </w:r>
-      <w:r>
-        <w:rPr>
-          <w:color w:val="444444"/>
-          <w:lang w:val="es-CO"/>
-        </w:rPr>
-        <w:t>opiar la clave generada y pegarla en el Apps Script (línea 1)</w:t>
+        <w:t>Copiar la clave generada y pegarla en el Apps Script (línea 1)</w:t>
       </w:r>
     </w:p>
     <w:p>
@@ -1505,14 +1061,7 @@
           <w:color w:val="444444"/>
           <w:lang w:val="es-CO"/>
         </w:rPr>
-        <w:t>En el editor de Apps Script hacer clic en Implementa</w:t>
-      </w:r>
-      <w:r>
-        <w:rPr>
-          <w:color w:val="444444"/>
-          <w:lang w:val="es-CO"/>
-        </w:rPr>
-        <w:t>r &gt; Nueva implementación</w:t>
+        <w:t>En el editor de Apps Script hacer clic en Implementar &gt; Nueva implementación</w:t>
       </w:r>
     </w:p>
     <w:p>
@@ -1524,33 +1073,11 @@
         </w:numPr>
         <w:spacing w:after="80"/>
       </w:pPr>
-      <w:proofErr w:type="spellStart"/>
-      <w:r>
-        <w:rPr>
-          <w:color w:val="444444"/>
-        </w:rPr>
-        <w:t>Tipo</w:t>
-      </w:r>
-      <w:proofErr w:type="spellEnd"/>
-      <w:r>
-        <w:rPr>
-          <w:color w:val="444444"/>
-        </w:rPr>
-        <w:t xml:space="preserve">: </w:t>
-      </w:r>
-      <w:proofErr w:type="spellStart"/>
-      <w:r>
-        <w:rPr>
-          <w:color w:val="444444"/>
-        </w:rPr>
-        <w:t>Aplicación</w:t>
-      </w:r>
-      <w:proofErr w:type="spellEnd"/>
-      <w:r>
-        <w:rPr>
-          <w:color w:val="444444"/>
-        </w:rPr>
-        <w:t xml:space="preserve"> web</w:t>
+      <w:r>
+        <w:rPr>
+          <w:color w:val="444444"/>
+        </w:rPr>
+        <w:t>Tipo: Aplicación web</w:t>
       </w:r>
     </w:p>
     <w:p>
@@ -1590,14 +1117,7 @@
           <w:color w:val="444444"/>
           <w:lang w:val="es-CO"/>
         </w:rPr>
-        <w:t>H</w:t>
-      </w:r>
-      <w:r>
-        <w:rPr>
-          <w:color w:val="444444"/>
-          <w:lang w:val="es-CO"/>
-        </w:rPr>
-        <w:t>acer clic en Implementar y aceptar los permisos</w:t>
+        <w:t>Hacer clic en Implementar y aceptar los permisos</w:t>
       </w:r>
     </w:p>
     <w:p>
@@ -1618,23 +1138,7 @@
           <w:lang w:val="es-CO"/>
         </w:rPr>
         <w:lastRenderedPageBreak/>
-        <w:t>Copiar la URL generada — termina en /</w:t>
-      </w:r>
-      <w:proofErr w:type="spellStart"/>
-      <w:r>
-        <w:rPr>
-          <w:color w:val="444444"/>
-          <w:lang w:val="es-CO"/>
-        </w:rPr>
-        <w:t>exec</w:t>
-      </w:r>
-      <w:proofErr w:type="spellEnd"/>
-      <w:r>
-        <w:rPr>
-          <w:color w:val="444444"/>
-          <w:lang w:val="es-CO"/>
-        </w:rPr>
-        <w:t xml:space="preserve"> y guardarla</w:t>
+        <w:t>Copiar la URL generada — termina en /exec y guardarla</w:t>
       </w:r>
     </w:p>
     <w:p>
@@ -1696,14 +1200,7 @@
           <w:color w:val="444444"/>
           <w:lang w:val="es-CO"/>
         </w:rPr>
-        <w:t>B</w:t>
-      </w:r>
-      <w:r>
-        <w:rPr>
-          <w:color w:val="444444"/>
-          <w:lang w:val="es-CO"/>
-        </w:rPr>
-        <w:t>uscar esta línea al final del archivo:</w:t>
+        <w:t>Buscar esta línea al final del archivo:</w:t>
       </w:r>
     </w:p>
     <w:p>
@@ -1711,7 +1208,6 @@
         <w:spacing w:after="80"/>
         <w:ind w:left="720"/>
       </w:pPr>
-      <w:proofErr w:type="spellStart"/>
       <w:r>
         <w:rPr>
           <w:rFonts w:ascii="Courier New" w:eastAsia="Courier New" w:hAnsi="Courier New" w:cs="Courier New"/>
@@ -1719,17 +1215,7 @@
           <w:sz w:val="20"/>
           <w:szCs w:val="20"/>
         </w:rPr>
-        <w:t>const</w:t>
-      </w:r>
-      <w:proofErr w:type="spellEnd"/>
-      <w:r>
-        <w:rPr>
-          <w:rFonts w:ascii="Courier New" w:eastAsia="Courier New" w:hAnsi="Courier New" w:cs="Courier New"/>
-          <w:color w:val="333333"/>
-          <w:sz w:val="20"/>
-          <w:szCs w:val="20"/>
-        </w:rPr>
-        <w:t xml:space="preserve"> APPS_SCRIPT_URL = 'https://script.google.com/macros/s/YOUR_DEPLOYMENT_ID/exec';</w:t>
+        <w:t>const APPS_SCRIPT_URL = 'https://script.google.com/macros/s/YOUR_DEPLOYMENT_ID/exec';</w:t>
       </w:r>
     </w:p>
     <w:p>
@@ -1761,34 +1247,12 @@
         </w:numPr>
         <w:spacing w:after="80"/>
       </w:pPr>
-      <w:proofErr w:type="spellStart"/>
-      <w:r>
-        <w:rPr>
-          <w:color w:val="444444"/>
-        </w:rPr>
-        <w:t>Guardar</w:t>
-      </w:r>
-      <w:proofErr w:type="spellEnd"/>
-      <w:r>
-        <w:rPr>
-          <w:color w:val="444444"/>
-        </w:rPr>
-        <w:t xml:space="preserve"> el</w:t>
-      </w:r>
-      <w:r>
-        <w:rPr>
-          <w:color w:val="444444"/>
-        </w:rPr>
-        <w:t xml:space="preserve"> </w:t>
-      </w:r>
-      <w:proofErr w:type="spellStart"/>
-      <w:r>
-        <w:rPr>
-          <w:color w:val="444444"/>
-        </w:rPr>
-        <w:t>archivo</w:t>
-      </w:r>
-      <w:proofErr w:type="spellEnd"/>
+      <w:r>
+        <w:rPr>
+          <w:color w:val="444444"/>
+        </w:rPr>
+        <w:t>Guardar el archivo</w:t>
+      </w:r>
     </w:p>
     <w:p>
       <w:pPr>
@@ -1823,15 +1287,7 @@
         <w:pStyle w:val="Ttulo2"/>
       </w:pPr>
       <w:r>
-        <w:t xml:space="preserve">Paso 6 – </w:t>
-      </w:r>
-      <w:proofErr w:type="spellStart"/>
-      <w:r>
-        <w:t>Conectar</w:t>
-      </w:r>
-      <w:proofErr w:type="spellEnd"/>
-      <w:r>
-        <w:t xml:space="preserve"> Looker Studio</w:t>
+        <w:t>Paso 6 – Conectar Looker Studio</w:t>
       </w:r>
     </w:p>
     <w:p>
@@ -1871,23 +1327,7 @@
           <w:color w:val="444444"/>
           <w:lang w:val="es-CO"/>
         </w:rPr>
-        <w:t xml:space="preserve">Seleccionar Google </w:t>
-      </w:r>
-      <w:proofErr w:type="spellStart"/>
-      <w:r>
-        <w:rPr>
-          <w:color w:val="444444"/>
-          <w:lang w:val="es-CO"/>
-        </w:rPr>
-        <w:t>Sheets</w:t>
-      </w:r>
-      <w:proofErr w:type="spellEnd"/>
-      <w:r>
-        <w:rPr>
-          <w:color w:val="444444"/>
-          <w:lang w:val="es-CO"/>
-        </w:rPr>
-        <w:t xml:space="preserve"> como fuente de datos</w:t>
+        <w:t>Seleccionar Google Sheets como fuente de datos</w:t>
       </w:r>
     </w:p>
     <w:p>
@@ -1907,40 +1347,8 @@
           <w:color w:val="444444"/>
           <w:lang w:val="es-CO"/>
         </w:rPr>
-        <w:t xml:space="preserve">Elegir el archivo Alegra </w:t>
-      </w:r>
-      <w:proofErr w:type="spellStart"/>
-      <w:r>
-        <w:rPr>
-          <w:color w:val="444444"/>
-          <w:lang w:val="es-CO"/>
-        </w:rPr>
-        <w:t>Feedback</w:t>
-      </w:r>
-      <w:proofErr w:type="spellEnd"/>
-      <w:r>
-        <w:rPr>
-          <w:color w:val="444444"/>
-          <w:lang w:val="es-CO"/>
-        </w:rPr>
-        <w:t xml:space="preserve"> Sy</w:t>
-      </w:r>
-      <w:r>
-        <w:rPr>
-          <w:color w:val="444444"/>
-          <w:lang w:val="es-CO"/>
-        </w:rPr>
-        <w:t xml:space="preserve">stem y la hoja </w:t>
-      </w:r>
-      <w:proofErr w:type="spellStart"/>
-      <w:r>
-        <w:rPr>
-          <w:color w:val="444444"/>
-          <w:lang w:val="es-CO"/>
-        </w:rPr>
-        <w:t>Feedback</w:t>
-      </w:r>
-      <w:proofErr w:type="spellEnd"/>
+        <w:t>Elegir el archivo Alegra Feedback System y la hoja Feedback</w:t>
+      </w:r>
     </w:p>
     <w:p>
       <w:pPr>
@@ -1999,23 +1407,7 @@
           <w:color w:val="444444"/>
           <w:lang w:val="es-CO"/>
         </w:rPr>
-        <w:t xml:space="preserve">Agregar los gráficos: Cuadro de resultados (total de </w:t>
-      </w:r>
-      <w:proofErr w:type="spellStart"/>
-      <w:r>
-        <w:rPr>
-          <w:color w:val="444444"/>
-          <w:lang w:val="es-CO"/>
-        </w:rPr>
-        <w:t>feedbacks</w:t>
-      </w:r>
-      <w:proofErr w:type="spellEnd"/>
-      <w:r>
-        <w:rPr>
-          <w:color w:val="444444"/>
-          <w:lang w:val="es-CO"/>
-        </w:rPr>
-        <w:t>), Barras verticales (por producto), Circular (distribución de sentimiento), Tabla (detalle completo)</w:t>
+        <w:t>Agregar los gráficos: Cuadro de resultados (total de feedbacks), Barras verticales (por producto), Circular (distribución de sentimiento), Tabla (detalle completo)</w:t>
       </w:r>
     </w:p>
     <w:p>
@@ -2029,23 +1421,16 @@
     <w:p>
       <w:pPr>
         <w:pStyle w:val="Ttulo1"/>
-      </w:pPr>
-      <w:r>
-        <w:t xml:space="preserve">6. Cómo </w:t>
-      </w:r>
-      <w:proofErr w:type="spellStart"/>
-      <w:r>
-        <w:t>usar</w:t>
-      </w:r>
-      <w:proofErr w:type="spellEnd"/>
-      <w:r>
-        <w:t xml:space="preserve"> el </w:t>
-      </w:r>
-      <w:proofErr w:type="spellStart"/>
-      <w:r>
-        <w:t>sistema</w:t>
-      </w:r>
-      <w:proofErr w:type="spellEnd"/>
+        <w:rPr>
+          <w:lang w:val="es-CO"/>
+        </w:rPr>
+      </w:pPr>
+      <w:r>
+        <w:rPr>
+          <w:lang w:val="es-CO"/>
+        </w:rPr>
+        <w:t>6. Cómo usar el sistema</w:t>
+      </w:r>
     </w:p>
     <w:p>
       <w:pPr>
@@ -2066,16 +1451,8 @@
         <w:rPr>
           <w:lang w:val="es-CO"/>
         </w:rPr>
-        <w:t xml:space="preserve">Enviar un </w:t>
-      </w:r>
-      <w:proofErr w:type="spellStart"/>
-      <w:r>
-        <w:rPr>
-          <w:lang w:val="es-CO"/>
-        </w:rPr>
-        <w:t>feedback</w:t>
-      </w:r>
-      <w:proofErr w:type="spellEnd"/>
+        <w:t>Enviar un feedback</w:t>
+      </w:r>
     </w:p>
     <w:p>
       <w:pPr>
@@ -2094,14 +1471,7 @@
           <w:color w:val="444444"/>
           <w:lang w:val="es-CO"/>
         </w:rPr>
-        <w:t>Abrir el archivo alegra-feedback.html con doble</w:t>
-      </w:r>
-      <w:r>
-        <w:rPr>
-          <w:color w:val="444444"/>
-          <w:lang w:val="es-CO"/>
-        </w:rPr>
-        <w:t xml:space="preserve"> clic — se abre en el navegador</w:t>
+        <w:t>Abrir el archivo alegra-feedback.html con doble clic — se abre en el navegador</w:t>
       </w:r>
     </w:p>
     <w:p>
@@ -2141,17 +1511,8 @@
           <w:color w:val="444444"/>
           <w:lang w:val="es-CO"/>
         </w:rPr>
-        <w:t xml:space="preserve">Escribir el comentario y hacer clic en Enviar </w:t>
-      </w:r>
-      <w:proofErr w:type="spellStart"/>
-      <w:r>
-        <w:rPr>
-          <w:color w:val="444444"/>
-          <w:lang w:val="es-CO"/>
-        </w:rPr>
-        <w:t>feedback</w:t>
-      </w:r>
-      <w:proofErr w:type="spellEnd"/>
+        <w:t>Escribir el comentario y hacer clic en Enviar feedback</w:t>
+      </w:r>
     </w:p>
     <w:p>
       <w:pPr>
@@ -2165,38 +1526,13 @@
           <w:lang w:val="es-CO"/>
         </w:rPr>
       </w:pPr>
-      <w:proofErr w:type="spellStart"/>
-      <w:r>
-        <w:rPr>
-          <w:color w:val="444444"/>
-          <w:lang w:val="es-CO"/>
-        </w:rPr>
-        <w:t>Gemini</w:t>
-      </w:r>
-      <w:proofErr w:type="spellEnd"/>
-      <w:r>
-        <w:rPr>
-          <w:color w:val="444444"/>
-          <w:lang w:val="es-CO"/>
-        </w:rPr>
-        <w:t xml:space="preserve"> analiza el comentario y en segundos aparece el sentimiento y resumen en el Google </w:t>
-      </w:r>
-      <w:proofErr w:type="spellStart"/>
-      <w:r>
-        <w:rPr>
-          <w:color w:val="444444"/>
-          <w:lang w:val="es-CO"/>
-        </w:rPr>
-        <w:t>S</w:t>
-      </w:r>
-      <w:r>
-        <w:rPr>
-          <w:color w:val="444444"/>
-          <w:lang w:val="es-CO"/>
-        </w:rPr>
-        <w:t>heet</w:t>
-      </w:r>
-      <w:proofErr w:type="spellEnd"/>
+      <w:r>
+        <w:rPr>
+          <w:color w:val="444444"/>
+          <w:lang w:val="es-CO"/>
+        </w:rPr>
+        <w:t>Gemini analiza el comentario y en segundos aparece el sentimiento y resumen en el Google Sheet</w:t>
+      </w:r>
     </w:p>
     <w:p>
       <w:pPr>
@@ -2217,16 +1553,8 @@
         <w:rPr>
           <w:lang w:val="es-CO"/>
         </w:rPr>
-        <w:t xml:space="preserve">Revisar los datos en Google </w:t>
-      </w:r>
-      <w:proofErr w:type="spellStart"/>
-      <w:r>
-        <w:rPr>
-          <w:lang w:val="es-CO"/>
-        </w:rPr>
-        <w:t>Sheets</w:t>
-      </w:r>
-      <w:proofErr w:type="spellEnd"/>
+        <w:t>Revisar los datos en Google Sheets</w:t>
+      </w:r>
     </w:p>
     <w:p>
       <w:pPr>
@@ -2237,47 +1565,11 @@
         </w:numPr>
         <w:spacing w:after="80"/>
       </w:pPr>
-      <w:proofErr w:type="spellStart"/>
-      <w:r>
-        <w:rPr>
-          <w:color w:val="444444"/>
-        </w:rPr>
-        <w:t>Abrir</w:t>
-      </w:r>
-      <w:proofErr w:type="spellEnd"/>
-      <w:r>
-        <w:rPr>
-          <w:color w:val="444444"/>
-        </w:rPr>
-        <w:t xml:space="preserve"> el </w:t>
-      </w:r>
-      <w:proofErr w:type="spellStart"/>
-      <w:r>
-        <w:rPr>
-          <w:color w:val="444444"/>
-        </w:rPr>
-        <w:t>archivo</w:t>
-      </w:r>
-      <w:proofErr w:type="spellEnd"/>
-      <w:r>
-        <w:rPr>
-          <w:color w:val="444444"/>
-        </w:rPr>
-        <w:t xml:space="preserve"> </w:t>
-      </w:r>
-      <w:proofErr w:type="spellStart"/>
-      <w:r>
-        <w:rPr>
-          <w:color w:val="444444"/>
-        </w:rPr>
-        <w:t>Alegra</w:t>
-      </w:r>
-      <w:proofErr w:type="spellEnd"/>
-      <w:r>
-        <w:rPr>
-          <w:color w:val="444444"/>
-        </w:rPr>
-        <w:t xml:space="preserve"> Feedback System en Google Sheets</w:t>
+      <w:r>
+        <w:rPr>
+          <w:color w:val="444444"/>
+        </w:rPr>
+        <w:t>Abrir el archivo Alegra Feedback System en Google Sheets</w:t>
       </w:r>
     </w:p>
     <w:p>
@@ -2317,24 +1609,8 @@
           <w:color w:val="444444"/>
           <w:lang w:val="es-CO"/>
         </w:rPr>
-        <w:t>La columna F muestra el resumen generado automáti</w:t>
-      </w:r>
-      <w:r>
-        <w:rPr>
-          <w:color w:val="444444"/>
-          <w:lang w:val="es-CO"/>
-        </w:rPr>
-        <w:t xml:space="preserve">camente por </w:t>
-      </w:r>
-      <w:proofErr w:type="spellStart"/>
-      <w:r>
-        <w:rPr>
-          <w:color w:val="444444"/>
-          <w:lang w:val="es-CO"/>
-        </w:rPr>
-        <w:t>Gemini</w:t>
-      </w:r>
-      <w:proofErr w:type="spellEnd"/>
+        <w:t>La columna F muestra el resumen generado automáticamente por Gemini</w:t>
+      </w:r>
     </w:p>
     <w:p>
       <w:pPr>
@@ -2356,35 +1632,7 @@
           <w:lang w:val="es-CO"/>
         </w:rPr>
         <w:lastRenderedPageBreak/>
-        <w:t xml:space="preserve">Ver el </w:t>
-      </w:r>
-      <w:proofErr w:type="spellStart"/>
-      <w:r>
-        <w:rPr>
-          <w:lang w:val="es-CO"/>
-        </w:rPr>
-        <w:t>dashboard</w:t>
-      </w:r>
-      <w:proofErr w:type="spellEnd"/>
-      <w:r>
-        <w:rPr>
-          <w:lang w:val="es-CO"/>
-        </w:rPr>
-        <w:t xml:space="preserve"> en </w:t>
-      </w:r>
-      <w:proofErr w:type="spellStart"/>
-      <w:r>
-        <w:rPr>
-          <w:lang w:val="es-CO"/>
-        </w:rPr>
-        <w:t>Looker</w:t>
-      </w:r>
-      <w:proofErr w:type="spellEnd"/>
-      <w:r>
-        <w:rPr>
-          <w:lang w:val="es-CO"/>
-        </w:rPr>
-        <w:t xml:space="preserve"> Studio</w:t>
+        <w:t>Ver el dashboard en Looker Studio</w:t>
       </w:r>
     </w:p>
     <w:p>
@@ -2404,23 +1652,7 @@
           <w:color w:val="444444"/>
           <w:lang w:val="es-CO"/>
         </w:rPr>
-        <w:t xml:space="preserve">Abrir el informe en </w:t>
-      </w:r>
-      <w:proofErr w:type="spellStart"/>
-      <w:r>
-        <w:rPr>
-          <w:color w:val="444444"/>
-          <w:lang w:val="es-CO"/>
-        </w:rPr>
-        <w:t>Looker</w:t>
-      </w:r>
-      <w:proofErr w:type="spellEnd"/>
-      <w:r>
-        <w:rPr>
-          <w:color w:val="444444"/>
-          <w:lang w:val="es-CO"/>
-        </w:rPr>
-        <w:t xml:space="preserve"> Studio desde lookerstudio.google.com</w:t>
+        <w:t>Abrir el informe en Looker Studio desde lookerstudio.google.com</w:t>
       </w:r>
     </w:p>
     <w:p>
@@ -2476,16 +1708,8 @@
         <w:pStyle w:val="Ttulo1"/>
       </w:pPr>
       <w:r>
-        <w:t>7. V</w:t>
-      </w:r>
-      <w:r>
-        <w:t xml:space="preserve">ariables de </w:t>
-      </w:r>
-      <w:proofErr w:type="spellStart"/>
-      <w:r>
-        <w:t>configuración</w:t>
-      </w:r>
-      <w:proofErr w:type="spellEnd"/>
+        <w:t>7. Variables de configuración</w:t>
+      </w:r>
     </w:p>
     <w:p>
       <w:pPr>
@@ -2515,12 +1739,6 @@
         <w:gridCol w:w="4160"/>
       </w:tblGrid>
       <w:tr>
-        <w:tblPrEx>
-          <w:tblCellMar>
-            <w:top w:w="0" w:type="dxa"/>
-            <w:bottom w:w="0" w:type="dxa"/>
-          </w:tblCellMar>
-        </w:tblPrEx>
         <w:tc>
           <w:tcPr>
             <w:tcW w:w="2400" w:type="dxa"/>
@@ -2569,7 +1787,6 @@
             </w:tcMar>
           </w:tcPr>
           <w:p>
-            <w:proofErr w:type="spellStart"/>
             <w:r>
               <w:rPr>
                 <w:b/>
@@ -2580,7 +1797,6 @@
               </w:rPr>
               <w:t>Archivo</w:t>
             </w:r>
-            <w:proofErr w:type="spellEnd"/>
           </w:p>
         </w:tc>
         <w:tc>
@@ -2601,7 +1817,6 @@
             </w:tcMar>
           </w:tcPr>
           <w:p>
-            <w:proofErr w:type="spellStart"/>
             <w:r>
               <w:rPr>
                 <w:b/>
@@ -2612,17 +1827,10 @@
               </w:rPr>
               <w:t>Descripción</w:t>
             </w:r>
-            <w:proofErr w:type="spellEnd"/>
           </w:p>
         </w:tc>
       </w:tr>
       <w:tr>
-        <w:tblPrEx>
-          <w:tblCellMar>
-            <w:top w:w="0" w:type="dxa"/>
-            <w:bottom w:w="0" w:type="dxa"/>
-          </w:tblCellMar>
-        </w:tblPrEx>
         <w:tc>
           <w:tcPr>
             <w:tcW w:w="2400" w:type="dxa"/>
@@ -2675,25 +1883,7 @@
                 <w:sz w:val="20"/>
                 <w:szCs w:val="20"/>
               </w:rPr>
-              <w:t xml:space="preserve">Code.gs — </w:t>
-            </w:r>
-            <w:proofErr w:type="spellStart"/>
-            <w:r>
-              <w:rPr>
-                <w:color w:val="444444"/>
-                <w:sz w:val="20"/>
-                <w:szCs w:val="20"/>
-              </w:rPr>
-              <w:t>línea</w:t>
-            </w:r>
-            <w:proofErr w:type="spellEnd"/>
-            <w:r>
-              <w:rPr>
-                <w:color w:val="444444"/>
-                <w:sz w:val="20"/>
-                <w:szCs w:val="20"/>
-              </w:rPr>
-              <w:t xml:space="preserve"> 1</w:t>
+              <w:t>Code.gs — línea 1</w:t>
             </w:r>
           </w:p>
         </w:tc>
@@ -2727,38 +1917,12 @@
                 <w:szCs w:val="20"/>
                 <w:lang w:val="es-CO"/>
               </w:rPr>
-              <w:t xml:space="preserve">Clave de </w:t>
-            </w:r>
-            <w:proofErr w:type="spellStart"/>
-            <w:r>
-              <w:rPr>
-                <w:color w:val="444444"/>
-                <w:sz w:val="20"/>
-                <w:szCs w:val="20"/>
-                <w:lang w:val="es-CO"/>
-              </w:rPr>
-              <w:t>Gemini</w:t>
-            </w:r>
-            <w:proofErr w:type="spellEnd"/>
-            <w:r>
-              <w:rPr>
-                <w:color w:val="444444"/>
-                <w:sz w:val="20"/>
-                <w:szCs w:val="20"/>
-                <w:lang w:val="es-CO"/>
-              </w:rPr>
-              <w:t>. Conseguirla en aistudio.google.com</w:t>
+              <w:t>Clave de Gemini. Conseguirla en aistudio.google.com</w:t>
             </w:r>
           </w:p>
         </w:tc>
       </w:tr>
       <w:tr>
-        <w:tblPrEx>
-          <w:tblCellMar>
-            <w:top w:w="0" w:type="dxa"/>
-            <w:bottom w:w="0" w:type="dxa"/>
-          </w:tblCellMar>
-        </w:tblPrEx>
         <w:tc>
           <w:tcPr>
             <w:tcW w:w="2400" w:type="dxa"/>
@@ -2851,12 +2015,6 @@
         </w:tc>
       </w:tr>
       <w:tr>
-        <w:tblPrEx>
-          <w:tblCellMar>
-            <w:top w:w="0" w:type="dxa"/>
-            <w:bottom w:w="0" w:type="dxa"/>
-          </w:tblCellMar>
-        </w:tblPrEx>
         <w:tc>
           <w:tcPr>
             <w:tcW w:w="2400" w:type="dxa"/>
@@ -2881,18 +2039,8 @@
                 <w:sz w:val="20"/>
                 <w:szCs w:val="20"/>
               </w:rPr>
-              <w:t xml:space="preserve">Nombre de la </w:t>
+              <w:t>Nombre de la hoja</w:t>
             </w:r>
-            <w:proofErr w:type="spellStart"/>
-            <w:r>
-              <w:rPr>
-                <w:color w:val="444444"/>
-                <w:sz w:val="20"/>
-                <w:szCs w:val="20"/>
-              </w:rPr>
-              <w:t>hoja</w:t>
-            </w:r>
-            <w:proofErr w:type="spellEnd"/>
           </w:p>
         </w:tc>
         <w:tc>
@@ -2953,27 +2101,7 @@
                 <w:szCs w:val="20"/>
                 <w:lang w:val="es-CO"/>
               </w:rPr>
-              <w:t xml:space="preserve">Debe llamarse exactamente </w:t>
-            </w:r>
-            <w:proofErr w:type="spellStart"/>
-            <w:r>
-              <w:rPr>
-                <w:color w:val="444444"/>
-                <w:sz w:val="20"/>
-                <w:szCs w:val="20"/>
-                <w:lang w:val="es-CO"/>
-              </w:rPr>
-              <w:t>Feedback</w:t>
-            </w:r>
-            <w:proofErr w:type="spellEnd"/>
-            <w:r>
-              <w:rPr>
-                <w:color w:val="444444"/>
-                <w:sz w:val="20"/>
-                <w:szCs w:val="20"/>
-                <w:lang w:val="es-CO"/>
-              </w:rPr>
-              <w:t xml:space="preserve"> (con mayúscula).</w:t>
+              <w:t>Debe llamarse exactamente Feedback (con mayúscula).</w:t>
             </w:r>
           </w:p>
         </w:tc>
@@ -2992,29 +2120,8 @@
         <w:pStyle w:val="Ttulo1"/>
       </w:pPr>
       <w:r>
-        <w:t xml:space="preserve">8. </w:t>
-      </w:r>
-      <w:proofErr w:type="spellStart"/>
-      <w:r>
-        <w:t>Errores</w:t>
-      </w:r>
-      <w:proofErr w:type="spellEnd"/>
-      <w:r>
-        <w:t xml:space="preserve"> </w:t>
-      </w:r>
-      <w:proofErr w:type="spellStart"/>
-      <w:r>
-        <w:t>comunes</w:t>
-      </w:r>
-      <w:proofErr w:type="spellEnd"/>
-      <w:r>
-        <w:t xml:space="preserve"> y </w:t>
-      </w:r>
-      <w:proofErr w:type="spellStart"/>
-      <w:r>
-        <w:t>soluciones</w:t>
-      </w:r>
-      <w:proofErr w:type="spellEnd"/>
+        <w:t>8. Errores comunes y soluciones</w:t>
+      </w:r>
     </w:p>
     <w:p>
       <w:pPr>
@@ -3043,12 +2150,6 @@
         <w:gridCol w:w="6217"/>
       </w:tblGrid>
       <w:tr>
-        <w:tblPrEx>
-          <w:tblCellMar>
-            <w:top w:w="0" w:type="dxa"/>
-            <w:bottom w:w="0" w:type="dxa"/>
-          </w:tblCellMar>
-        </w:tblPrEx>
         <w:trPr>
           <w:trHeight w:val="345"/>
         </w:trPr>
@@ -3100,7 +2201,6 @@
             </w:tcMar>
           </w:tcPr>
           <w:p>
-            <w:proofErr w:type="spellStart"/>
             <w:r>
               <w:rPr>
                 <w:b/>
@@ -3111,17 +2211,10 @@
               </w:rPr>
               <w:t>Solución</w:t>
             </w:r>
-            <w:proofErr w:type="spellEnd"/>
           </w:p>
         </w:tc>
       </w:tr>
       <w:tr>
-        <w:tblPrEx>
-          <w:tblCellMar>
-            <w:top w:w="0" w:type="dxa"/>
-            <w:bottom w:w="0" w:type="dxa"/>
-          </w:tblCellMar>
-        </w:tblPrEx>
         <w:trPr>
           <w:trHeight w:val="690"/>
         </w:trPr>
@@ -3149,25 +2242,7 @@
                 <w:sz w:val="20"/>
                 <w:szCs w:val="20"/>
               </w:rPr>
-              <w:t>Cannot read properties of null (</w:t>
-            </w:r>
-            <w:proofErr w:type="spellStart"/>
-            <w:r>
-              <w:rPr>
-                <w:color w:val="444444"/>
-                <w:sz w:val="20"/>
-                <w:szCs w:val="20"/>
-              </w:rPr>
-              <w:t>appendRow</w:t>
-            </w:r>
-            <w:proofErr w:type="spellEnd"/>
-            <w:r>
-              <w:rPr>
-                <w:color w:val="444444"/>
-                <w:sz w:val="20"/>
-                <w:szCs w:val="20"/>
-              </w:rPr>
-              <w:t>)</w:t>
+              <w:t>Cannot read properties of null (appendRow)</w:t>
             </w:r>
           </w:p>
         </w:tc>
@@ -3201,58 +2276,12 @@
                 <w:szCs w:val="20"/>
                 <w:lang w:val="es-CO"/>
               </w:rPr>
-              <w:t xml:space="preserve">La pestaña del </w:t>
-            </w:r>
-            <w:proofErr w:type="spellStart"/>
-            <w:r>
-              <w:rPr>
-                <w:color w:val="444444"/>
-                <w:sz w:val="20"/>
-                <w:szCs w:val="20"/>
-                <w:lang w:val="es-CO"/>
-              </w:rPr>
-              <w:t>Sheet</w:t>
-            </w:r>
-            <w:proofErr w:type="spellEnd"/>
-            <w:r>
-              <w:rPr>
-                <w:color w:val="444444"/>
-                <w:sz w:val="20"/>
-                <w:szCs w:val="20"/>
-                <w:lang w:val="es-CO"/>
-              </w:rPr>
-              <w:t xml:space="preserve"> no se llama </w:t>
-            </w:r>
-            <w:proofErr w:type="spellStart"/>
-            <w:r>
-              <w:rPr>
-                <w:color w:val="444444"/>
-                <w:sz w:val="20"/>
-                <w:szCs w:val="20"/>
-                <w:lang w:val="es-CO"/>
-              </w:rPr>
-              <w:t>Feedback</w:t>
-            </w:r>
-            <w:proofErr w:type="spellEnd"/>
-            <w:r>
-              <w:rPr>
-                <w:color w:val="444444"/>
-                <w:sz w:val="20"/>
-                <w:szCs w:val="20"/>
-                <w:lang w:val="es-CO"/>
-              </w:rPr>
-              <w:t>. Verificar que el nombre sea exacto.</w:t>
+              <w:t>La pestaña del Sheet no se llama Feedback. Verificar que el nombre sea exacto.</w:t>
             </w:r>
           </w:p>
         </w:tc>
       </w:tr>
       <w:tr>
-        <w:tblPrEx>
-          <w:tblCellMar>
-            <w:top w:w="0" w:type="dxa"/>
-            <w:bottom w:w="0" w:type="dxa"/>
-          </w:tblCellMar>
-        </w:tblPrEx>
         <w:trPr>
           <w:trHeight w:val="668"/>
         </w:trPr>
@@ -3320,12 +2349,6 @@
         </w:tc>
       </w:tr>
       <w:tr>
-        <w:tblPrEx>
-          <w:tblCellMar>
-            <w:top w:w="0" w:type="dxa"/>
-            <w:bottom w:w="0" w:type="dxa"/>
-          </w:tblCellMar>
-        </w:tblPrEx>
         <w:trPr>
           <w:trHeight w:val="690"/>
         </w:trPr>
@@ -3387,58 +2410,12 @@
                 <w:szCs w:val="20"/>
                 <w:lang w:val="es-CO"/>
               </w:rPr>
-              <w:t xml:space="preserve">El modelo de </w:t>
-            </w:r>
-            <w:proofErr w:type="spellStart"/>
-            <w:r>
-              <w:rPr>
-                <w:color w:val="444444"/>
-                <w:sz w:val="20"/>
-                <w:szCs w:val="20"/>
-                <w:lang w:val="es-CO"/>
-              </w:rPr>
-              <w:t>Gemini</w:t>
-            </w:r>
-            <w:proofErr w:type="spellEnd"/>
-            <w:r>
-              <w:rPr>
-                <w:color w:val="444444"/>
-                <w:sz w:val="20"/>
-                <w:szCs w:val="20"/>
-                <w:lang w:val="es-CO"/>
-              </w:rPr>
-              <w:t xml:space="preserve"> no existe. Ejecutar la función </w:t>
-            </w:r>
-            <w:proofErr w:type="spellStart"/>
-            <w:r>
-              <w:rPr>
-                <w:color w:val="444444"/>
-                <w:sz w:val="20"/>
-                <w:szCs w:val="20"/>
-                <w:lang w:val="es-CO"/>
-              </w:rPr>
-              <w:t>verModelos</w:t>
-            </w:r>
-            <w:proofErr w:type="spellEnd"/>
-            <w:r>
-              <w:rPr>
-                <w:color w:val="444444"/>
-                <w:sz w:val="20"/>
-                <w:szCs w:val="20"/>
-                <w:lang w:val="es-CO"/>
-              </w:rPr>
-              <w:t>() en Apps Script para ver los disponibles.</w:t>
+              <w:t>El modelo de Gemini no existe. Ejecutar la función verModelos() en Apps Script para ver los disponibles.</w:t>
             </w:r>
           </w:p>
         </w:tc>
       </w:tr>
       <w:tr>
-        <w:tblPrEx>
-          <w:tblCellMar>
-            <w:top w:w="0" w:type="dxa"/>
-            <w:bottom w:w="0" w:type="dxa"/>
-          </w:tblCellMar>
-        </w:tblPrEx>
         <w:trPr>
           <w:trHeight w:val="668"/>
         </w:trPr>
@@ -3472,16 +2449,7 @@
                 <w:szCs w:val="20"/>
                 <w:lang w:val="es-CO"/>
               </w:rPr>
-              <w:t>El formulario no</w:t>
-            </w:r>
-            <w:r>
-              <w:rPr>
-                <w:color w:val="444444"/>
-                <w:sz w:val="20"/>
-                <w:szCs w:val="20"/>
-                <w:lang w:val="es-CO"/>
-              </w:rPr>
-              <w:t xml:space="preserve"> guarda datos</w:t>
+              <w:t>El formulario no guarda datos</w:t>
             </w:r>
           </w:p>
         </w:tc>
@@ -3521,12 +2489,6 @@
         </w:tc>
       </w:tr>
       <w:tr>
-        <w:tblPrEx>
-          <w:tblCellMar>
-            <w:top w:w="0" w:type="dxa"/>
-            <w:bottom w:w="0" w:type="dxa"/>
-          </w:tblCellMar>
-        </w:tblPrEx>
         <w:trPr>
           <w:trHeight w:val="345"/>
         </w:trPr>
@@ -3610,6 +2572,51 @@
           <w:lang w:val="es-CO"/>
         </w:rPr>
       </w:pPr>
+      <w:r>
+        <w:rPr>
+          <w:lang w:val="es-CO"/>
+        </w:rPr>
+        <w:t xml:space="preserve">Link de INFORME: </w:t>
+      </w:r>
+      <w:hyperlink r:id="rId7" w:history="1">
+        <w:r>
+          <w:rPr>
+            <w:rStyle w:val="Hipervnculo"/>
+            <w:lang w:val="es-CO"/>
+          </w:rPr>
+          <w:t>https://lookerstudio.google.com/reporting/7d1fd253-5d75-4e17-a0af-946726cc1afe</w:t>
+        </w:r>
+      </w:hyperlink>
+    </w:p>
+    <w:p>
+      <w:pPr>
+        <w:pBdr>
+          <w:top w:val="single" w:sz="4" w:space="0" w:color="00C17C"/>
+        </w:pBdr>
+        <w:spacing w:before="480"/>
+      </w:pPr>
+      <w:r>
+        <w:lastRenderedPageBreak/>
+        <w:t xml:space="preserve">Link google sheet: </w:t>
+      </w:r>
+      <w:hyperlink r:id="rId8" w:history="1">
+        <w:r>
+          <w:rPr>
+            <w:rStyle w:val="Hipervnculo"/>
+          </w:rPr>
+          <w:t>https://docs.google.com/spreadsheets/d/1wS0K5jbLktgbQgKnkcYsaRj9OAYFEq8p8iJduuu95u4/edit?usp=sharing</w:t>
+        </w:r>
+      </w:hyperlink>
+    </w:p>
+    <w:p>
+      <w:pPr>
+        <w:pBdr>
+          <w:top w:val="single" w:sz="4" w:space="0" w:color="00C17C"/>
+        </w:pBdr>
+        <w:spacing w:before="480"/>
+      </w:pPr>
+      <w:bookmarkStart w:id="0" w:name="_GoBack"/>
+      <w:bookmarkEnd w:id="0"/>
     </w:p>
     <w:sectPr>
       <w:pgSz w:w="12240" w:h="15840"/>

</xml_diff>